<commit_message>
cambio nombre de .docx 's y aumento de tamaño de bundle que habilita .json
</commit_message>
<xml_diff>
--- a/public/templates/liquidacion-inquilino-base.docx
+++ b/public/templates/liquidacion-inquilino-base.docx
@@ -289,19 +289,11 @@
                 <w:lang w:val="es-AR"/>
               </w:rPr>
             </w:pPr>
-            <w:proofErr w:type="gramStart"/>
-            <w:r>
-              <w:rPr>
-                <w:lang w:val="es-AR"/>
-              </w:rPr>
-              <w:t>TOTAL</w:t>
-            </w:r>
-            <w:proofErr w:type="gramEnd"/>
-            <w:r>
-              <w:rPr>
-                <w:lang w:val="es-AR"/>
-              </w:rPr>
-              <w:t xml:space="preserve"> ENTREGADO A PAGAR</w:t>
+            <w:r>
+              <w:rPr>
+                <w:lang w:val="es-AR"/>
+              </w:rPr>
+              <w:t>TOTAL A PAGAR</w:t>
             </w:r>
           </w:p>
         </w:tc>

</xml_diff>